<commit_message>
Updated assignment naming to assignment_3
</commit_message>
<xml_diff>
--- a/DOCUMENTATION.docx
+++ b/DOCUMENTATION.docx
@@ -33,7 +33,7 @@
           <w:color w:val="0D9488"/>
           <w:sz w:val="24"/>
         </w:rPr>
-        <w:t>Assignment 4: Responsive UI Layout, Core Widgets &amp; Material 3 Theming</w:t>
+        <w:t>Assignment 3: Responsive UI Layout, Core Widgets &amp; Material 3 Theming</w:t>
       </w:r>
     </w:p>
     <w:tbl>
@@ -266,7 +266,7 @@
     </w:p>
     <w:p>
       <w:r>
-        <w:t>This project showcases a production-ready, highly polished Profile Card screen built with the Flutter SDK. The objective of Assignment 4 is to demonstrate mastery over core Flutter layout paradigms, responsive container styling, idiomatic widget composition, and custom theme architecture. The implementation strictly adheres to the patterns established within the Cross-App curriculum, integrating clean architectural domain modeling and sound Dart 3 null safety.</w:t>
+        <w:t>This project showcases a production-ready, highly polished Profile Card screen built with the Flutter SDK. The objective of Assignment 3 is to demonstrate mastery over core Flutter layout paradigms, responsive container styling, idiomatic widget composition, and custom theme architecture. The implementation strictly adheres to the patterns established within the Cross-App curriculum, integrating clean architectural domain modeling and sound Dart 3 null safety.</w:t>
       </w:r>
     </w:p>
     <w:p>
@@ -2508,7 +2508,7 @@
     </w:p>
     <w:p>
       <w:r>
-        <w:t>The Assignment 4 Profile Card project successfully demonstrates full competence in Flutter's foundational layout system. By structuring the user interface with cohesive widget hierarchies, applying custom Material 3 color palettes, and adhering to clean code conventions, the resulting application is both visually stunning and technically robust. All requirements—including custom theme colors, responsive Column and Row layouts, rounded Container styling, dual CircleAvatars, and integrated iconography—have been thoroughly implemented, tested, and visually confirmed.</w:t>
+        <w:t>The Assignment 3 Profile Card project successfully demonstrates full competence in Flutter's foundational layout system. By structuring the user interface with cohesive widget hierarchies, applying custom Material 3 color palettes, and adhering to clean code conventions, the resulting application is both visually stunning and technically robust. All requirements—including custom theme colors, responsive Column and Row layouts, rounded Container styling, dual CircleAvatars, and integrated iconography—have been thoroughly implemented, tested, and visually confirmed.</w:t>
       </w:r>
     </w:p>
     <w:sectPr>

</xml_diff>